<commit_message>
1. load init base data after migrate 2. 테스트 시에는 자동화 제외 3. 문서
</commit_message>
<xml_diff>
--- a/doc/guide/1. 시스템 아키텍처 및 데이터 흐름도 (System Architecture & Data Flow).docx
+++ b/doc/guide/1. 시스템 아키텍처 및 데이터 흐름도 (System Architecture & Data Flow).docx
@@ -2660,7 +2660,7 @@
           <w:rFonts w:ascii="Arial Unicode MS" w:cs="Arial Unicode MS" w:eastAsia="Arial Unicode MS" w:hAnsi="Arial Unicode MS"/>
           <w:rtl w:val="0"/>
         </w:rPr>
-        <w:t xml:space="preserve">시스템 유지보수 효율성을 높이기 위해 주요 관리 작업이 자동화되어 있습니다.</w:t>
+        <w:t xml:space="preserve">시스템 유지보수 효율성과 개발 편의성을 높이기 위해 주요 관리 작업이 자동화되어 있습니다.</w:t>
       </w:r>
     </w:p>
     <w:p>
@@ -2753,7 +2753,7 @@
           <w:ilvl w:val="0"/>
           <w:numId w:val="2"/>
         </w:numPr>
-        <w:spacing w:after="240" w:before="0" w:beforeAutospacing="0" w:lineRule="auto"/>
+        <w:spacing w:after="0" w:afterAutospacing="0" w:before="0" w:beforeAutospacing="0" w:lineRule="auto"/>
         <w:ind w:left="720" w:hanging="360"/>
       </w:pPr>
       <w:r>
@@ -2789,8 +2789,140 @@
     </w:p>
     <w:p>
       <w:pPr>
-        <w:rPr/>
-      </w:pPr>
+        <w:numPr>
+          <w:ilvl w:val="0"/>
+          <w:numId w:val="2"/>
+        </w:numPr>
+        <w:spacing w:after="0" w:afterAutospacing="0" w:before="0" w:beforeAutospacing="0" w:lineRule="auto"/>
+        <w:ind w:left="720" w:hanging="360"/>
+      </w:pPr>
+      <w:r>
+        <w:rPr>
+          <w:b w:val="1"/>
+          <w:bCs w:val="1"/>
+          <w:rtl w:val="0"/>
+        </w:rPr>
+        <w:t xml:space="preserve">Superuser Creation:</w:t>
+      </w:r>
+      <w:r>
+        <w:rPr>
+          <w:rFonts w:ascii="Arial Unicode MS" w:cs="Arial Unicode MS" w:eastAsia="Arial Unicode MS" w:hAnsi="Arial Unicode MS"/>
+          <w:rtl w:val="0"/>
+        </w:rPr>
+        <w:t xml:space="preserve"> 계정 존재 확인 후 </w:t>
+      </w:r>
+      <w:r>
+        <w:rPr>
+          <w:rFonts w:ascii="Roboto Mono" w:cs="Roboto Mono" w:eastAsia="Roboto Mono" w:hAnsi="Roboto Mono"/>
+          <w:color w:val="188038"/>
+          <w:rtl w:val="0"/>
+        </w:rPr>
+        <w:t xml:space="preserve">cascading/qwer123$ </w:t>
+      </w:r>
+      <w:r>
+        <w:rPr>
+          <w:rFonts w:ascii="Arial Unicode MS" w:cs="Arial Unicode MS" w:eastAsia="Arial Unicode MS" w:hAnsi="Arial Unicode MS"/>
+          <w:rtl w:val="0"/>
+        </w:rPr>
+        <w:t xml:space="preserve">슈퍼유저를 자동 생성합니다. </w:t>
+      </w:r>
+      <w:r>
+        <w:rPr>
+          <w:rtl w:val="0"/>
+        </w:rPr>
+      </w:r>
+    </w:p>
+    <w:p>
+      <w:pPr>
+        <w:numPr>
+          <w:ilvl w:val="0"/>
+          <w:numId w:val="2"/>
+        </w:numPr>
+        <w:spacing w:after="0" w:afterAutospacing="0" w:before="0" w:beforeAutospacing="0" w:lineRule="auto"/>
+        <w:ind w:left="720" w:hanging="360"/>
+      </w:pPr>
+      <w:r>
+        <w:rPr>
+          <w:b w:val="1"/>
+          <w:bCs w:val="1"/>
+          <w:rtl w:val="0"/>
+        </w:rPr>
+        <w:t xml:space="preserve">Base Data Load:</w:t>
+      </w:r>
+      <w:r>
+        <w:rPr>
+          <w:rtl w:val="0"/>
+        </w:rPr>
+        <w:t xml:space="preserve"> </w:t>
+      </w:r>
+      <w:r>
+        <w:rPr>
+          <w:rFonts w:ascii="Roboto Mono" w:cs="Roboto Mono" w:eastAsia="Roboto Mono" w:hAnsi="Roboto Mono"/>
+          <w:color w:val="188038"/>
+          <w:rtl w:val="0"/>
+        </w:rPr>
+        <w:t xml:space="preserve">input_data/data/base_data</w:t>
+      </w:r>
+      <w:r>
+        <w:rPr>
+          <w:rFonts w:ascii="Arial Unicode MS" w:cs="Arial Unicode MS" w:eastAsia="Arial Unicode MS" w:hAnsi="Arial Unicode MS"/>
+          <w:rtl w:val="0"/>
+        </w:rPr>
+        <w:t xml:space="preserve"> 경로의 csv 파일에서 파일명과 동일하고 </w:t>
+      </w:r>
+      <w:r>
+        <w:rPr>
+          <w:rFonts w:ascii="Roboto Mono" w:cs="Roboto Mono" w:eastAsia="Roboto Mono" w:hAnsi="Roboto Mono"/>
+          <w:color w:val="188038"/>
+          <w:rtl w:val="0"/>
+        </w:rPr>
+        <w:t xml:space="preserve">base_</w:t>
+      </w:r>
+      <w:r>
+        <w:rPr>
+          <w:rFonts w:ascii="Arial Unicode MS" w:cs="Arial Unicode MS" w:eastAsia="Arial Unicode MS" w:hAnsi="Arial Unicode MS"/>
+          <w:rtl w:val="0"/>
+        </w:rPr>
+        <w:t xml:space="preserve"> 접두어가 붙은 모든 테이블에 데이터를 DB에 입력합니다. </w:t>
+      </w:r>
+    </w:p>
+    <w:p>
+      <w:pPr>
+        <w:keepNext w:val="0"/>
+        <w:keepLines w:val="0"/>
+        <w:pageBreakBefore w:val="0"/>
+        <w:widowControl w:val="0"/>
+        <w:numPr>
+          <w:ilvl w:val="0"/>
+          <w:numId w:val="2"/>
+        </w:numPr>
+        <w:pBdr>
+          <w:top w:space="0" w:sz="0" w:val="nil"/>
+          <w:left w:space="0" w:sz="0" w:val="nil"/>
+          <w:bottom w:space="0" w:sz="0" w:val="nil"/>
+          <w:right w:space="0" w:sz="0" w:val="nil"/>
+          <w:between w:space="0" w:sz="0" w:val="nil"/>
+        </w:pBdr>
+        <w:shd w:fill="auto" w:val="clear"/>
+        <w:spacing w:after="240" w:before="0" w:beforeAutospacing="0" w:line="240" w:lineRule="auto"/>
+        <w:ind w:left="720" w:right="0" w:hanging="360"/>
+        <w:jc w:val="left"/>
+      </w:pPr>
+      <w:r>
+        <w:rPr>
+          <w:rFonts w:ascii="Roboto Mono" w:cs="Roboto Mono" w:eastAsia="Roboto Mono" w:hAnsi="Roboto Mono"/>
+          <w:color w:val="188038"/>
+          <w:rtl w:val="0"/>
+        </w:rPr>
+        <w:t xml:space="preserve">pytest</w:t>
+      </w:r>
+      <w:r>
+        <w:rPr>
+          <w:rFonts w:ascii="Arial Unicode MS" w:cs="Arial Unicode MS" w:eastAsia="Arial Unicode MS" w:hAnsi="Arial Unicode MS"/>
+          <w:rtl w:val="0"/>
+        </w:rPr>
+        <w:t xml:space="preserve"> 실행 시 위 자동화 로직을 스킵하여 테스트 속도와 안정성을 확보했습니다.</w:t>
+      </w:r>
       <w:r>
         <w:rPr>
           <w:rtl w:val="0"/>

</xml_diff>